<commit_message>
Updated prove 01 docx file
</commit_message>
<xml_diff>
--- a/prove-01/Emily Jena_01-prove_response.docx
+++ b/prove-01/Emily Jena_01-prove_response.docx
@@ -167,31 +167,25 @@
     </w:tbl>
     <w:p/>
     <w:p>
-      <w:pPr>
+      <w:r>
         <w:rPr>
           <w:i/>
         </w:rPr>
-      </w:pPr>
+        <w:t xml:space="preserve">It is a violation of BYU-Idaho Honor Code to post or share this </w:t>
+      </w:r>
       <w:r>
         <w:rPr>
           <w:i/>
         </w:rPr>
-        <w:t xml:space="preserve">It is a violation of BYU-Idaho Honor Code to post or share this </w:t>
+        <w:t>document</w:t>
       </w:r>
       <w:r>
         <w:rPr>
           <w:i/>
         </w:rPr>
-        <w:t>document</w:t>
-      </w:r>
-      <w:r>
-        <w:rPr>
-          <w:i/>
-        </w:rPr>
         <w:t xml:space="preserve"> with others or to post it online.  Storage into a personal and private repository (e.g. private GitHub repository, unshared Google Drive folder) is acceptable.</w:t>
       </w:r>
     </w:p>
-    <w:p/>
     <w:p>
       <w:pPr>
         <w:rPr>
@@ -205,7 +199,6 @@
         </w:rPr>
         <w:t>Question 1</w:t>
       </w:r>
-      <w:proofErr w:type="gramStart"/>
       <w:r>
         <w:rPr>
           <w:b/>
@@ -216,14 +209,7 @@
         <w:rPr>
           <w:b/>
         </w:rPr>
-        <w:t>For</w:t>
-      </w:r>
-      <w:proofErr w:type="gramEnd"/>
-      <w:r>
-        <w:rPr>
-          <w:b/>
-        </w:rPr>
-        <w:t xml:space="preserve"> the rotate right problem</w:t>
+        <w:t>For the rotate right problem</w:t>
       </w:r>
       <w:r>
         <w:rPr>
@@ -272,29 +258,13 @@
         <w:rPr>
           <w:b/>
         </w:rPr>
-        <w:t xml:space="preserve">split index by subtracting the amount from the </w:t>
-      </w:r>
-      <w:proofErr w:type="spellStart"/>
-      <w:proofErr w:type="gramStart"/>
-      <w:r>
-        <w:rPr>
-          <w:b/>
-        </w:rPr>
-        <w:t>data.</w:t>
-      </w:r>
-      <w:r>
-        <w:rPr>
-          <w:b/>
-        </w:rPr>
-        <w:t>Count</w:t>
-      </w:r>
-      <w:proofErr w:type="spellEnd"/>
-      <w:proofErr w:type="gramEnd"/>
-      <w:r>
-        <w:rPr>
-          <w:b/>
-        </w:rPr>
-        <w:t xml:space="preserve"> to identify </w:t>
+        <w:t>split index by subtracting the amount from the data.</w:t>
+      </w:r>
+      <w:r>
+        <w:rPr>
+          <w:b/>
+        </w:rPr>
+        <w:t xml:space="preserve">Count to identify </w:t>
       </w:r>
       <w:r>
         <w:rPr>
@@ -441,28 +411,13 @@
           <w:b/>
           <w:u w:val="single"/>
         </w:rPr>
-        <w:t>Question 2</w:t>
-      </w:r>
-      <w:proofErr w:type="gramStart"/>
-      <w:r>
-        <w:rPr>
-          <w:b/>
-          <w:u w:val="single"/>
-        </w:rPr>
-        <w:t>:</w:t>
-      </w:r>
-      <w:r>
-        <w:rPr>
-          <w:b/>
-        </w:rPr>
-        <w:t xml:space="preserve">  For</w:t>
-      </w:r>
-      <w:proofErr w:type="gramEnd"/>
-      <w:r>
-        <w:rPr>
-          <w:b/>
-        </w:rPr>
-        <w:t xml:space="preserve"> the rotate right problem</w:t>
+        <w:t>Question 2:</w:t>
+      </w:r>
+      <w:r>
+        <w:rPr>
+          <w:b/>
+        </w:rPr>
+        <w:t xml:space="preserve">  For the rotate right problem</w:t>
       </w:r>
       <w:r>
         <w:rPr>
@@ -481,28 +436,55 @@
       <w:r>
         <w:tab/>
       </w:r>
+      <w:r>
+        <w:drawing>
+          <wp:inline distT="0" distB="0" distL="0" distR="0" wp14:anchorId="749A27F8" wp14:editId="630FB5A1">
+            <wp:extent cx="4614530" cy="3030997"/>
+            <wp:effectExtent l="0" t="0" r="0" b="0"/>
+            <wp:docPr id="648577783" name="Picture 1"/>
+            <wp:cNvGraphicFramePr>
+              <a:graphicFrameLocks xmlns:a="http://schemas.openxmlformats.org/drawingml/2006/main" noChangeAspect="1"/>
+            </wp:cNvGraphicFramePr>
+            <a:graphic xmlns:a="http://schemas.openxmlformats.org/drawingml/2006/main">
+              <a:graphicData uri="http://schemas.openxmlformats.org/drawingml/2006/picture">
+                <pic:pic xmlns:pic="http://schemas.openxmlformats.org/drawingml/2006/picture">
+                  <pic:nvPicPr>
+                    <pic:cNvPr id="648577783" name=""/>
+                    <pic:cNvPicPr/>
+                  </pic:nvPicPr>
+                  <pic:blipFill>
+                    <a:blip r:embed="rId5"/>
+                    <a:stretch>
+                      <a:fillRect/>
+                    </a:stretch>
+                  </pic:blipFill>
+                  <pic:spPr>
+                    <a:xfrm>
+                      <a:off x="0" y="0"/>
+                      <a:ext cx="4618568" cy="3033649"/>
+                    </a:xfrm>
+                    <a:prstGeom prst="rect">
+                      <a:avLst/>
+                    </a:prstGeom>
+                  </pic:spPr>
+                </pic:pic>
+              </a:graphicData>
+            </a:graphic>
+          </wp:inline>
+        </w:drawing>
+      </w:r>
     </w:p>
     <w:p/>
+    <w:p/>
     <w:p>
       <w:r>
         <w:rPr>
           <w:u w:val="single"/>
         </w:rPr>
-        <w:t>Remember</w:t>
-      </w:r>
-      <w:proofErr w:type="gramStart"/>
-      <w:r>
-        <w:rPr>
-          <w:u w:val="single"/>
-        </w:rPr>
-        <w:t>:</w:t>
-      </w:r>
-      <w:r>
-        <w:t xml:space="preserve">  You</w:t>
-      </w:r>
-      <w:proofErr w:type="gramEnd"/>
-      <w:r>
-        <w:t xml:space="preserve"> need to </w:t>
+        <w:t>Remember:</w:t>
+      </w:r>
+      <w:r>
+        <w:t xml:space="preserve">  You need to </w:t>
       </w:r>
       <w:r>
         <w:t xml:space="preserve">commit </w:t>

</xml_diff>